<commit_message>
Sua mensagem de commit aqui
</commit_message>
<xml_diff>
--- a/Modelo_1.docx
+++ b/Modelo_1.docx
@@ -240,7 +240,13 @@
     <w:p/>
     <w:p>
       <w:r>
-        <w:t>A parte requerente recebe Benefício de Prestação Continuada à Pessoa com Deficiência (BPC/LOAS) que corresponde ao valor de 1 (um) salário mínimo mensal, conforme comprovado em documentação anexa (Doc. 2).</w:t>
+        <w:t xml:space="preserve">A parte requerente recebe Benefício de Prestação Continuada à Pessoa com Deficiência (BPC/LOAS) que corresponde ao valor de 1 (um) </w:t>
+      </w:r>
+      <w:r>
+        <w:t>salário-mínimo</w:t>
+      </w:r>
+      <w:r>
+        <w:t xml:space="preserve"> mensal, conforme comprovado em documentação anexa (Doc. 2).</w:t>
       </w:r>
     </w:p>
     <w:p/>
@@ -480,11 +486,16 @@
         <w:t>taxa_juros_contrato</w:t>
       </w:r>
       <w:proofErr w:type="spellEnd"/>
+      <w:proofErr w:type="gramStart"/>
       <w:r>
         <w:t>}}</w:t>
       </w:r>
       <w:r>
-        <w:t>% a.m</w:t>
+        <w:t>%</w:t>
+      </w:r>
+      <w:proofErr w:type="gramEnd"/>
+      <w:r>
+        <w:t xml:space="preserve"> a.m</w:t>
       </w:r>
       <w:r>
         <w:t xml:space="preserve">., o que gerou à parte requerente uma dívida correspondente a </w:t>
@@ -540,8 +551,13 @@
         <w:t>taxa_media_bacen</w:t>
       </w:r>
       <w:proofErr w:type="spellEnd"/>
-      <w:r>
-        <w:t xml:space="preserve">}}% </w:t>
+      <w:proofErr w:type="gramStart"/>
+      <w:r>
+        <w:t>}}%</w:t>
+      </w:r>
+      <w:proofErr w:type="gramEnd"/>
+      <w:r>
+        <w:t xml:space="preserve"> </w:t>
       </w:r>
       <w:proofErr w:type="spellStart"/>
       <w:r>
@@ -1100,7 +1116,7 @@
               </wp:anchor>
             </w:drawing>
           </mc:Choice>
-          <mc:Fallback xmlns:sl="http://schemas.openxmlformats.org/schemaLibrary/2006/main" xmlns:a="http://schemas.openxmlformats.org/drawingml/2006/main" xmlns:pic="http://schemas.openxmlformats.org/drawingml/2006/picture" xmlns:c="http://schemas.openxmlformats.org/drawingml/2006/chart" xmlns:lc="http://schemas.openxmlformats.org/drawingml/2006/lockedCanvas" xmlns:dgm="http://schemas.openxmlformats.org/drawingml/2006/diagram" xmlns="http://schemas.microsoft.com/office/tasks/2019/documenttasks" xmlns:cr="http://schemas.microsoft.com/office/comments/2020/reactions">
+          <mc:Fallback xmlns:cr="http://schemas.microsoft.com/office/comments/2020/reactions" xmlns="http://schemas.microsoft.com/office/tasks/2019/documenttasks" xmlns:dgm="http://schemas.openxmlformats.org/drawingml/2006/diagram" xmlns:lc="http://schemas.openxmlformats.org/drawingml/2006/lockedCanvas" xmlns:c="http://schemas.openxmlformats.org/drawingml/2006/chart" xmlns:pic="http://schemas.openxmlformats.org/drawingml/2006/picture" xmlns:a="http://schemas.openxmlformats.org/drawingml/2006/main" xmlns:sl="http://schemas.openxmlformats.org/schemaLibrary/2006/main">
             <w:drawing>
               <wp:anchor allowOverlap="1" behindDoc="0" distB="0" distT="0" distL="114300" distR="114300" hidden="0" layoutInCell="1" locked="0" relativeHeight="0" simplePos="0">
                 <wp:simplePos x="0" y="0"/>
@@ -1471,7 +1487,27 @@
           <w:color w:val="000000"/>
           <w:highlight w:val="yellow"/>
         </w:rPr>
-        <w:t xml:space="preserve">A tese da exclusividade do dolo inviabiliza, por exemplo, a devolução em dobro de pacotes de serviços, no caso de telefonia, jamais solicitados pelo consumidor e sobre o qual o fornecedor do serviço invoque qualquer "justificativa do seu engano". Isso porque o requisito subjetivo da má-fé é prova substancialmente difícil de produzir. Exigir que o consumidor prove dolo ou má-fé do fornecedor é imputar-lhe prova diabólica, padrão probatório que vai de encontro às próprias filosofia e </w:t>
+        <w:t xml:space="preserve">A tese da exclusividade do dolo inviabiliza, por exemplo, a devolução em dobro de pacotes de serviços, no caso de telefonia, jamais solicitados pelo consumidor e sobre o qual o fornecedor do serviço invoque qualquer "justificativa do seu engano". Isso porque o requisito subjetivo da má-fé é prova substancialmente difícil de produzir. Exigir que o consumidor prove dolo ou má-fé do fornecedor é imputar-lhe prova diabólica, padrão probatório que vai de encontro às </w:t>
+      </w:r>
+      <w:proofErr w:type="gramStart"/>
+      <w:r>
+        <w:rPr>
+          <w:b/>
+          <w:i/>
+          <w:color w:val="000000"/>
+          <w:highlight w:val="yellow"/>
+        </w:rPr>
+        <w:t>próprias filosofia</w:t>
+      </w:r>
+      <w:proofErr w:type="gramEnd"/>
+      <w:r>
+        <w:rPr>
+          <w:b/>
+          <w:i/>
+          <w:color w:val="000000"/>
+          <w:highlight w:val="yellow"/>
+        </w:rPr>
+        <w:t xml:space="preserve"> e </w:t>
       </w:r>
       <w:proofErr w:type="spellStart"/>
       <w:r>
@@ -1767,6 +1803,7 @@
     <w:p>
       <w:pPr>
         <w:rPr>
+          <w:b/>
           <w:sz w:val="28"/>
           <w:szCs w:val="28"/>
           <w:highlight w:val="yellow"/>
@@ -1782,7 +1819,7 @@
           <w:szCs w:val="28"/>
           <w:highlight w:val="yellow"/>
         </w:rPr>
-        <w:t>comprometeu 76,52%</w:t>
+        <w:t xml:space="preserve">comprometeu </w:t>
       </w:r>
       <w:r>
         <w:rPr>
@@ -1791,7 +1828,7 @@
           <w:szCs w:val="28"/>
           <w:highlight w:val="yellow"/>
         </w:rPr>
-        <w:t xml:space="preserve"> (REPETE A CONTA LÁ DE CIMA)</w:t>
+        <w:t>{</w:t>
       </w:r>
       <w:r>
         <w:rPr>
@@ -1800,26 +1837,28 @@
           <w:szCs w:val="28"/>
           <w:highlight w:val="yellow"/>
         </w:rPr>
-        <w:t xml:space="preserve"> de uma renda que já era de um salário mínimo.</w:t>
-      </w:r>
-    </w:p>
-    <w:p>
-      <w:pPr>
-        <w:rPr>
+        <w:t>{</w:t>
+      </w:r>
+      <w:proofErr w:type="spellStart"/>
+      <w:r>
+        <w:rPr>
+          <w:b/>
           <w:sz w:val="28"/>
           <w:szCs w:val="28"/>
           <w:highlight w:val="yellow"/>
         </w:rPr>
-      </w:pPr>
-    </w:p>
-    <w:p>
-      <w:pPr>
+        <w:t>comprometimento_renda</w:t>
+      </w:r>
+      <w:proofErr w:type="spellEnd"/>
+      <w:r>
         <w:rPr>
           <w:b/>
           <w:sz w:val="28"/>
           <w:szCs w:val="28"/>
-        </w:rPr>
-      </w:pPr>
+          <w:highlight w:val="yellow"/>
+        </w:rPr>
+        <w:t>}</w:t>
+      </w:r>
       <w:r>
         <w:rPr>
           <w:b/>
@@ -1827,8 +1866,7 @@
           <w:szCs w:val="28"/>
           <w:highlight w:val="yellow"/>
         </w:rPr>
-        <w:lastRenderedPageBreak/>
-        <w:t xml:space="preserve">A parte requerente, em função da prática abusiva da requerida está sobrevivendo com apenas R$331,52 </w:t>
+        <w:t>}</w:t>
       </w:r>
       <w:r>
         <w:rPr>
@@ -1837,8 +1875,9 @@
           <w:szCs w:val="28"/>
           <w:highlight w:val="yellow"/>
         </w:rPr>
-        <w:t xml:space="preserve">(REPETE A CONTA LÁ DE CIMA) </w:t>
-      </w:r>
+        <w:t xml:space="preserve"> de uma renda que já era de um </w:t>
+      </w:r>
+      <w:proofErr w:type="gramStart"/>
       <w:r>
         <w:rPr>
           <w:b/>
@@ -1846,8 +1885,9 @@
           <w:szCs w:val="28"/>
           <w:highlight w:val="yellow"/>
         </w:rPr>
-        <w:t>por mês, cerca de R$11,00</w:t>
-      </w:r>
+        <w:t>salário mínimo</w:t>
+      </w:r>
+      <w:proofErr w:type="gramEnd"/>
       <w:r>
         <w:rPr>
           <w:b/>
@@ -1855,16 +1895,123 @@
           <w:szCs w:val="28"/>
           <w:highlight w:val="yellow"/>
         </w:rPr>
-        <w:t xml:space="preserve"> (VALOR ACIMA DIVIDO POR 30)</w:t>
-      </w:r>
-      <w:r>
-        <w:rPr>
-          <w:b/>
+        <w:t>.</w:t>
+      </w:r>
+    </w:p>
+    <w:p>
+      <w:pPr>
+        <w:rPr>
           <w:sz w:val="28"/>
           <w:szCs w:val="28"/>
           <w:highlight w:val="yellow"/>
         </w:rPr>
-        <w:t xml:space="preserve"> por dia!! É um escracho!!</w:t>
+      </w:pPr>
+    </w:p>
+    <w:p>
+      <w:pPr>
+        <w:rPr>
+          <w:b/>
+          <w:sz w:val="28"/>
+          <w:szCs w:val="28"/>
+          <w:highlight w:val="yellow"/>
+        </w:rPr>
+      </w:pPr>
+      <w:r>
+        <w:rPr>
+          <w:b/>
+          <w:sz w:val="28"/>
+          <w:szCs w:val="28"/>
+          <w:highlight w:val="yellow"/>
+        </w:rPr>
+        <w:lastRenderedPageBreak/>
+        <w:t xml:space="preserve">A parte requerente, em função da prática abusiva da requerida está sobrevivendo com apenas </w:t>
+      </w:r>
+      <w:r>
+        <w:rPr>
+          <w:b/>
+          <w:sz w:val="28"/>
+          <w:szCs w:val="28"/>
+          <w:highlight w:val="yellow"/>
+        </w:rPr>
+        <w:t>{{</w:t>
+      </w:r>
+      <w:proofErr w:type="spellStart"/>
+      <w:r>
+        <w:rPr>
+          <w:b/>
+          <w:sz w:val="28"/>
+          <w:szCs w:val="28"/>
+          <w:highlight w:val="yellow"/>
+        </w:rPr>
+        <w:t>valor_</w:t>
+      </w:r>
+      <w:proofErr w:type="gramStart"/>
+      <w:r>
+        <w:rPr>
+          <w:b/>
+          <w:sz w:val="28"/>
+          <w:szCs w:val="28"/>
+          <w:highlight w:val="yellow"/>
+        </w:rPr>
+        <w:t>liquido</w:t>
+      </w:r>
+      <w:proofErr w:type="spellEnd"/>
+      <w:proofErr w:type="gramEnd"/>
+      <w:r>
+        <w:rPr>
+          <w:b/>
+          <w:sz w:val="28"/>
+          <w:szCs w:val="28"/>
+          <w:highlight w:val="yellow"/>
+        </w:rPr>
+        <w:t>}}</w:t>
+      </w:r>
+      <w:r>
+        <w:rPr>
+          <w:b/>
+          <w:sz w:val="28"/>
+          <w:szCs w:val="28"/>
+          <w:highlight w:val="yellow"/>
+        </w:rPr>
+        <w:t xml:space="preserve"> por mês, cerca de </w:t>
+      </w:r>
+      <w:r>
+        <w:rPr>
+          <w:b/>
+          <w:sz w:val="28"/>
+          <w:szCs w:val="28"/>
+          <w:highlight w:val="yellow"/>
+        </w:rPr>
+        <w:t>{{</w:t>
+      </w:r>
+      <w:proofErr w:type="spellStart"/>
+      <w:r>
+        <w:rPr>
+          <w:b/>
+          <w:sz w:val="28"/>
+          <w:szCs w:val="28"/>
+          <w:highlight w:val="yellow"/>
+        </w:rPr>
+        <w:t>Valor_diario</w:t>
+      </w:r>
+      <w:proofErr w:type="spellEnd"/>
+      <w:r>
+        <w:rPr>
+          <w:b/>
+          <w:sz w:val="28"/>
+          <w:szCs w:val="28"/>
+          <w:highlight w:val="yellow"/>
+        </w:rPr>
+        <w:t>}} por</w:t>
+      </w:r>
+      <w:r>
+        <w:rPr>
+          <w:b/>
+          <w:sz w:val="28"/>
+          <w:szCs w:val="28"/>
+          <w:highlight w:val="yellow"/>
+        </w:rPr>
+        <w:t xml:space="preserve"> dia!! É um escracho!!</w:t>
       </w:r>
     </w:p>
     <w:p/>
@@ -1917,7 +2064,15 @@
     <w:p/>
     <w:p>
       <w:r>
-        <w:t>O Código de Defesa do Consumidor (CDC) prevê, em seu artigo 6º, inciso VIII, a possibilidade de inversão do ônus da prova em favor do consumidor, quando, a critério do juiz, for verossímil a alegação ou quando o consumidor for hipossuficiente, segundo as regras ordinárias de experiências. Tal previsão visa equilibrar a relação entre consumidor e fornecedor, especialmente em situações onde o consumidor se encontra em desvantagem técnica, econômica ou jurídica.</w:t>
+        <w:t xml:space="preserve">O Código de Defesa do Consumidor (CDC) prevê, em seu artigo 6º, inciso VIII, a possibilidade de inversão do ônus da prova em favor do consumidor, quando, a critério do juiz, for verossímil a alegação ou quando o consumidor for hipossuficiente, segundo as regras ordinárias de experiências. Tal previsão visa equilibrar a relação entre consumidor e fornecedor, especialmente em situações </w:t>
+      </w:r>
+      <w:proofErr w:type="gramStart"/>
+      <w:r>
+        <w:t>onde</w:t>
+      </w:r>
+      <w:proofErr w:type="gramEnd"/>
+      <w:r>
+        <w:t xml:space="preserve"> o consumidor se encontra em desvantagem técnica, econômica ou jurídica.</w:t>
       </w:r>
     </w:p>
     <w:p>
@@ -2112,13 +2267,13 @@
           <w:color w:val="000000"/>
           <w:highlight w:val="yellow"/>
         </w:rPr>
-        <w:t>R$ 18.727,20 (referente ao contrato 1)</w:t>
-      </w:r>
-      <w:r>
-        <w:rPr>
-          <w:color w:val="000000"/>
-        </w:rPr>
-        <w:t xml:space="preserve"> + R$ 6.027,12 (referente ao contrato 2);</w:t>
+        <w:t>R$ 18.727,20 (referente ao contrato)</w:t>
+      </w:r>
+      <w:r>
+        <w:rPr>
+          <w:color w:val="000000"/>
+        </w:rPr>
+        <w:t xml:space="preserve"> </w:t>
       </w:r>
     </w:p>
     <w:p>
@@ -2244,8 +2399,15 @@
         <w:jc w:val="center"/>
       </w:pPr>
       <w:r>
-        <w:lastRenderedPageBreak/>
-        <w:t>Batatais/SP, 18 de Novembro de 2024</w:t>
+        <w:t xml:space="preserve">Batatais/SP, 18 de </w:t>
+      </w:r>
+      <w:proofErr w:type="gramStart"/>
+      <w:r>
+        <w:t>Novembro</w:t>
+      </w:r>
+      <w:proofErr w:type="gramEnd"/>
+      <w:r>
+        <w:t xml:space="preserve"> de 2024</w:t>
       </w:r>
     </w:p>
     <w:p>
@@ -2395,108 +2557,6 @@
     </w:p>
     <w:p>
       <w:pPr>
-        <w:ind w:firstLine="0"/>
-      </w:pPr>
-    </w:p>
-    <w:p>
-      <w:pPr>
-        <w:pStyle w:val="PargrafodaLista"/>
-        <w:numPr>
-          <w:ilvl w:val="0"/>
-          <w:numId w:val="5"/>
-        </w:numPr>
-      </w:pPr>
-      <w:r>
-        <w:t>RENDA MENSAL LÍQUIDA</w:t>
-      </w:r>
-    </w:p>
-    <w:p>
-      <w:pPr>
-        <w:pStyle w:val="PargrafodaLista"/>
-        <w:numPr>
-          <w:ilvl w:val="0"/>
-          <w:numId w:val="5"/>
-        </w:numPr>
-      </w:pPr>
-      <w:r>
-        <w:t>VALOR PARCELA EMPRÉSTIMO CONSIGNADO</w:t>
-      </w:r>
-    </w:p>
-    <w:p>
-      <w:pPr>
-        <w:pStyle w:val="PargrafodaLista"/>
-        <w:numPr>
-          <w:ilvl w:val="0"/>
-          <w:numId w:val="5"/>
-        </w:numPr>
-      </w:pPr>
-      <w:r>
-        <w:t>VALOR PARCELA EMPRÉSTIMO PESSOAL</w:t>
-      </w:r>
-    </w:p>
-    <w:p>
-      <w:pPr>
-        <w:pStyle w:val="PargrafodaLista"/>
-        <w:numPr>
-          <w:ilvl w:val="0"/>
-          <w:numId w:val="5"/>
-        </w:numPr>
-      </w:pPr>
-      <w:r>
-        <w:t>DATA DE CONTRATAÇÃO EMPRÉSTIMO PESSOAL</w:t>
-      </w:r>
-    </w:p>
-    <w:p>
-      <w:pPr>
-        <w:pStyle w:val="PargrafodaLista"/>
-        <w:numPr>
-          <w:ilvl w:val="0"/>
-          <w:numId w:val="5"/>
-        </w:numPr>
-      </w:pPr>
-      <w:r>
-        <w:t>VALOR FINANCIADO EMPRÉSTIMO PESSOAL</w:t>
-      </w:r>
-    </w:p>
-    <w:p>
-      <w:pPr>
-        <w:pStyle w:val="PargrafodaLista"/>
-        <w:numPr>
-          <w:ilvl w:val="0"/>
-          <w:numId w:val="5"/>
-        </w:numPr>
-      </w:pPr>
-      <w:r>
-        <w:t>QUANTIDADE DE PARCELAS EMPRÉSTIMO PESSOAL</w:t>
-      </w:r>
-    </w:p>
-    <w:p>
-      <w:pPr>
-        <w:pStyle w:val="PargrafodaLista"/>
-        <w:numPr>
-          <w:ilvl w:val="0"/>
-          <w:numId w:val="5"/>
-        </w:numPr>
-      </w:pPr>
-      <w:r>
-        <w:t>TAXA DE JUROS APLICADA NO CONTRATO</w:t>
-      </w:r>
-    </w:p>
-    <w:p>
-      <w:pPr>
-        <w:pStyle w:val="PargrafodaLista"/>
-        <w:numPr>
-          <w:ilvl w:val="0"/>
-          <w:numId w:val="5"/>
-        </w:numPr>
-      </w:pPr>
-      <w:r>
-        <w:t>TAXA DE JURO MÉDIA BACEN</w:t>
-      </w:r>
-    </w:p>
-    <w:p>
-      <w:pPr>
-        <w:pStyle w:val="PargrafodaLista"/>
         <w:ind w:firstLine="0"/>
       </w:pPr>
     </w:p>
@@ -3975,6 +4035,72 @@
       <w:szCs w:val="48"/>
     </w:rPr>
   </w:style>
+  <w:style w:type="character" w:styleId="Refdecomentrio">
+    <w:name w:val="annotation reference"/>
+    <w:basedOn w:val="Fontepargpadro"/>
+    <w:uiPriority w:val="99"/>
+    <w:semiHidden/>
+    <w:unhideWhenUsed/>
+    <w:rsid w:val="00B200AB"/>
+    <w:rPr>
+      <w:sz w:val="16"/>
+      <w:szCs w:val="16"/>
+    </w:rPr>
+  </w:style>
+  <w:style w:type="paragraph" w:styleId="Textodecomentrio">
+    <w:name w:val="annotation text"/>
+    <w:basedOn w:val="Normal"/>
+    <w:link w:val="TextodecomentrioChar"/>
+    <w:uiPriority w:val="99"/>
+    <w:unhideWhenUsed/>
+    <w:rsid w:val="00B200AB"/>
+    <w:pPr>
+      <w:spacing w:line="240" w:lineRule="auto"/>
+    </w:pPr>
+    <w:rPr>
+      <w:sz w:val="20"/>
+      <w:szCs w:val="20"/>
+    </w:rPr>
+  </w:style>
+  <w:style w:type="character" w:customStyle="1" w:styleId="TextodecomentrioChar">
+    <w:name w:val="Texto de comentário Char"/>
+    <w:basedOn w:val="Fontepargpadro"/>
+    <w:link w:val="Textodecomentrio"/>
+    <w:uiPriority w:val="99"/>
+    <w:rsid w:val="00B200AB"/>
+    <w:rPr>
+      <w:sz w:val="20"/>
+      <w:szCs w:val="20"/>
+    </w:rPr>
+  </w:style>
+  <w:style w:type="paragraph" w:styleId="Assuntodocomentrio">
+    <w:name w:val="annotation subject"/>
+    <w:basedOn w:val="Textodecomentrio"/>
+    <w:next w:val="Textodecomentrio"/>
+    <w:link w:val="AssuntodocomentrioChar"/>
+    <w:uiPriority w:val="99"/>
+    <w:semiHidden/>
+    <w:unhideWhenUsed/>
+    <w:rsid w:val="00B200AB"/>
+    <w:rPr>
+      <w:b/>
+      <w:bCs/>
+    </w:rPr>
+  </w:style>
+  <w:style w:type="character" w:customStyle="1" w:styleId="AssuntodocomentrioChar">
+    <w:name w:val="Assunto do comentário Char"/>
+    <w:basedOn w:val="TextodecomentrioChar"/>
+    <w:link w:val="Assuntodocomentrio"/>
+    <w:uiPriority w:val="99"/>
+    <w:semiHidden/>
+    <w:rsid w:val="00B200AB"/>
+    <w:rPr>
+      <w:b/>
+      <w:bCs/>
+      <w:sz w:val="20"/>
+      <w:szCs w:val="20"/>
+    </w:rPr>
+  </w:style>
 </w:styles>
 </file>
 

</xml_diff>